<commit_message>
Update links for GitHub username rename to ddkeyworth
</commit_message>
<xml_diff>
--- a/Example Co. AI - Code Appendix.docx
+++ b/Example Co. AI - Code Appendix.docx
@@ -88,7 +88,7 @@
         <w:t xml:space="preserve"> </w:t>
       </w:r>
       <w:r>
-        <w:t xml:space="preserve">https://github.com/dan-nackasha-keyworth/ExampleCo-AI-test</w:t>
+        <w:t xml:space="preserve">https://github.com/ddkeyworth/ExampleCo-AI-test</w:t>
       </w:r>
     </w:p>
     <w:p>
@@ -12052,7 +12052,7 @@
         <w:rPr>
           <w:rStyle w:val="VerbatimChar"/>
         </w:rPr>
-        <w:t xml:space="preserve">    parser.add_argument("--split", choices=["dev", "held_out", "fresh_check", "success_mailbox", "routing_fix_check", "all"], default="dev",</w:t>
+        <w:t xml:space="preserve">    parser.add_argument("--split", choices=["dev", "held_out", "fresh_check", "success_mailbox", "routing_fix_check", "final_check", "all"], default="dev",</w:t>
       </w:r>
       <w:r>
         <w:br/>

</xml_diff>